<commit_message>
feat(contrato): signing fee split up to 3x, prices from args, drop onboarding sheet
- cobranca_asaas.py: --taxa/--parcelas-taxa; monthly plan with fee creates
  two subscriptions (N months of price + fee/N, then price until 12 months),
  leftover cent on the first charge
- gerar_contrato.py: clause 05.1 shows only the chosen plan with --valor and
  the fee line; 09.4 uses the monthly price (annual: price/10)
- template: fee refunded under 06.1/06.2 guarantees, fee installments due in
  the 3-month minimum stay owed (09.2)
- dinheiro.py: shared BRL formatting, pt-BR amount in words, fee split
- skill: remove Google Drive onboarding sheet step and link from WhatsApp

Co-Authored-By: Claude Opus 5.5 <noreply@anthropic.com>
</commit_message>
<xml_diff>
--- a/apresentacao-devadvance/contratos/Contrato_Programa_ADVANCE_Turma_Fundadora.docx
+++ b/apresentacao-devadvance/contratos/Contrato_Programa_ADVANCE_Turma_Fundadora.docx
@@ -1988,7 +1988,7 @@
           <w:szCs w:val="22"/>
           <w:rtl w:val="0"/>
         </w:rPr>
-        <w:t xml:space="preserve"> até 7 (sete) dias corridos a contar da confirmação do primeiro pagamento, o CONTRATANTE poderá desistir do Contrato por qualquer motivo e sem necessidade de justificativa, com reembolso integral dos valores pagos no prazo de até 10 (dez) dias úteis, ainda que já tenha acessado a plataforma ou realizado o onboarding. Esta garantia amplia o direito de arrependimento do artigo 49 do CDC.</w:t>
+        <w:t xml:space="preserve"> até 7 (sete) dias corridos a contar da confirmação do primeiro pagamento, o CONTRATANTE poderá desistir do Contrato por qualquer motivo e sem necessidade de justificativa, com reembolso integral dos valores pagos, inclusive de eventual taxa de adesão, no prazo de até 10 (dez) dias úteis, ainda que já tenha acessado a plataforma ou realizado o onboarding. Esta garantia amplia o direito de arrependimento do artigo 49 do CDC.</w:t>
       </w:r>
     </w:p>
     <w:p>
@@ -2028,7 +2028,7 @@
           <w:szCs w:val="22"/>
           <w:rtl w:val="0"/>
         </w:rPr>
-        <w:t xml:space="preserve"> se, ao final dos 90 (noventa) primeiros dias, o CONTRATANTE considerar que não avançou no objetivo de 90 dias definido no onboarding, poderá solicitar o reembolso integral de todos os valores pagos até então, desde que, cumulativamente:</w:t>
+        <w:t xml:space="preserve"> se, ao final dos 90 (noventa) primeiros dias, o CONTRATANTE considerar que não avançou no objetivo de 90 dias definido no onboarding, poderá solicitar o reembolso integral de todos os valores pagos até então, inclusive de eventual taxa de adesão, desde que, cumulativamente:</w:t>
       </w:r>
     </w:p>
     <w:p>
@@ -2753,7 +2753,7 @@
           <w:szCs w:val="22"/>
           <w:rtl w:val="0"/>
         </w:rPr>
-        <w:t>09.2 – Durante a permanência mínima de 3 (três) meses, o cancelamento por iniciativa do CONTRATANTE fora das hipóteses de garantia não gera reembolso das parcelas já pagas, permanecendo devidas as parcelas restantes do período mínimo, considerando que a vaga na turma e no pod é limitada, reservada ao CONTRATANTE e envolve alocação dedicada de recursos da CONTRATADA.</w:t>
+        <w:t>09.2 – Durante a permanência mínima de 3 (três) meses, o cancelamento por iniciativa do CONTRATANTE fora das hipóteses de garantia não gera reembolso das parcelas já pagas, permanecendo devidas as mensalidades e as parcelas de eventual taxa de adesão com vencimento no período mínimo, considerando que a vaga na turma e no pod é limitada, reservada ao CONTRATANTE e envolve alocação dedicada de recursos da CONTRATADA.</w:t>
       </w:r>
     </w:p>
     <w:p>

</xml_diff>